<commit_message>
Improve MICE safety decision briefs
</commit_message>
<xml_diff>
--- a/outputs/may-2026-real-events/details/03-hangang-drone-light-show-2026/bundle/documents/safety-plan.docx
+++ b/outputs/may-2026-real-events/details/03-hangang-drone-light-show-2026/bundle/documents/safety-plan.docx
@@ -7201,27 +7201,22 @@
     </w:p>
     <w:p>
       <w:r>
-        <w:t xml:space="preserve">| 3 | 옥외광고 담당부서/베뉴 | 현수막·배너·안내판·전기 광고물 허가/신고 | 옥외 임시 안내물, 지주형 표시물, 전광류 또는 전기 사용 광고물을 설치하는 경우 | 표시·설치 전 | 옥외광고물법 시행령 제5·7·12·14조와 관할 조례 확인 | open |</w:t>
-      </w:r>
-    </w:p>
-    <w:p>
-      <w:r>
-        <w:t xml:space="preserve">| 4 | 관할 건축부서/베뉴 시설팀 | 가설건축물 축조신고서, 피난안전 확인서, 임시사용승인 확인 | 대형 텐트, 임시 전시장, 복층/다층 임시구조물, 공사 중 구역 임시 사용 | 설치 전 신고·승인, 개장 전 피난안전 확인 | 건축법 시행규칙 별지 제8·8의2·17호서식 | open |</w:t>
-      </w:r>
-    </w:p>
-    <w:p>
-      <w:r>
-        <w:t xml:space="preserve">| 5 | 소방서/베뉴 방재실/안전총괄 | 소방·피난 점검표, 화기·위험물 반입 승인, 임시소방시설 확인 | 화기, 위험물, 임시전기, 부스·무대 설치, 피난통로 차단 위험이 있는 경우 | 설치 전, 개장 전, 피크 전, 철거 전 | 화재예방법·소방시설법 하위 별표와 베뉴 방재실 승인조건 | open |</w:t>
-      </w:r>
-    </w:p>
-    <w:p>
-      <w:r>
-        <w:t xml:space="preserve">| 6 | 의료담당/AED 관리책임자/119·이송병원 | 응급의료·AED·구급 이송 계획, AED 점검·교육·관리서류 | 대규모 인파, 고령자/영유아/장애인, 스탠딩 공연, 야외·폭염·야간 행사 | 개장 전, 운영 중, 사용/이송 발생 시 | 응급의료법 AED 설치·관리, 시행규칙 구급차 장비·운행기록 기준 | open |</w:t>
-      </w:r>
-    </w:p>
-    <w:p>
-      <w:r>
-        <w:t xml:space="preserve">| 7 | 시공/하역/전기 협력사/안전총괄 | 설치·철거 작업자 안전계획서, 작업계획서, 교육명단, PPE·작업중지 기준 | 부스·무대·트러스·전기·고소·중량물·화기·철거 작업이 있는 경우 | 작업 전, 작업 중 변경 시, 철거 전 | 산안법, 산안기준규칙 제38·42·321조, KOSHA Guide worker-safety layer | open |</w:t>
+        <w:t xml:space="preserve">| 3 | 관할 건축부서/베뉴 시설팀 | 가설건축물 축조신고서, 피난안전 확인서, 임시사용승인 확인 | 대형 텐트, 임시 전시장, 복층/다층 임시구조물, 공사 중 구역 임시 사용 | 설치 전 신고·승인, 개장 전 피난안전 확인 | 건축법 시행규칙 별지 제8·8의2·17호서식 | open |</w:t>
+      </w:r>
+    </w:p>
+    <w:p>
+      <w:r>
+        <w:t xml:space="preserve">| 4 | 소방서/베뉴 방재실/안전총괄 | 소방·피난 점검표, 화기·위험물 반입 승인, 임시소방시설 확인 | 화기, 위험물, 임시전기, 부스·무대 설치, 피난통로 차단 위험이 있는 경우 | 설치 전, 개장 전, 피크 전, 철거 전 | 화재예방법·소방시설법 하위 별표와 베뉴 방재실 승인조건 | open |</w:t>
+      </w:r>
+    </w:p>
+    <w:p>
+      <w:r>
+        <w:t xml:space="preserve">| 5 | 의료담당/AED 관리책임자/119·이송병원 | 응급의료·AED·구급 이송 계획, AED 점검·교육·관리서류 | 대규모 인파, 고령자/영유아/장애인, 스탠딩 공연, 야외·폭염·야간 행사 | 개장 전, 운영 중, 사용/이송 발생 시 | 응급의료법 AED 설치·관리, 시행규칙 구급차 장비·운행기록 기준 | open |</w:t>
+      </w:r>
+    </w:p>
+    <w:p>
+      <w:r>
+        <w:t xml:space="preserve">| 6 | 시공/하역/전기 협력사/안전총괄 | 설치·철거 작업자 안전계획서, 작업계획서, 교육명단, PPE·작업중지 기준 | 부스·무대·트러스·전기·고소·중량물·화기·철거 작업이 있는 경우 | 작업 전, 작업 중 변경 시, 철거 전 | 산안법, 산안기준규칙 제38·42·321조, KOSHA Guide worker-safety layer | open |</w:t>
       </w:r>
     </w:p>
     <w:p/>

</xml_diff>